<commit_message>
Documentar uso responsable de IA
</commit_message>
<xml_diff>
--- a/Guia_defensa_TFG.docx
+++ b/Guia_defensa_TFG.docx
@@ -10251,7 +10251,7 @@
         <w:pStyle w:val="Respuestatribunal"/>
       </w:pPr>
       <w:r>
-        <w:t>No. Es un índice de riesgo ponderado que mezcla una puntuación experta y una probabilidad. Comparten escala, pero no interpretación estadística. La calibración queda como mejora.</w:t>
+        <w:t>No. Es un índice de riesgo ponderado que mezcla una puntuación experta y una probabilidad. Comparten escala, pero no interpretación estadística. La fusión 45/55 y el umbral 21 se eligieron con 40 casos separados; todavía deben confirmarse sobre correo real reciente e independiente.</w:t>
       </w:r>
     </w:p>
     <w:p>
@@ -10411,7 +10411,7 @@
         <w:pStyle w:val="Respuestatribunal"/>
       </w:pPr>
       <w:r>
-        <w:t>Serializa el pipeline completo y simplifica inferencia. Debe cargarse solo desde fuentes confiables y convendría versionar dependencias y separar datos de entrenamiento.</w:t>
+        <w:t>Serializa el pipeline completo y simplifica la inferencia. Debe cargarse solo desde fuentes confiables. El repositorio fija las dependencias y registra los metadatos y la huella de cada versión activa.</w:t>
       </w:r>
     </w:p>
     <w:p>
@@ -10509,6 +10509,22 @@
       </w:pPr>
       <w:r>
         <w:t>La separación entre entrada, normalización, señales, puntuación, explicación y modelo; permite razonar sobre cada decisión, probarla y sustituir componentes sin rehacer todo el sistema.</w:t>
+      </w:r>
+    </w:p>
+    <w:p>
+      <w:pPr>
+        <w:pStyle w:val="Preguntatribunal"/>
+      </w:pPr>
+      <w:r>
+        <w:t>¿Has utilizado inteligencia artificial durante el desarrollo?</w:t>
+      </w:r>
+    </w:p>
+    <w:p>
+      <w:pPr>
+        <w:pStyle w:val="Respuestatribunal"/>
+      </w:pPr>
+      <w:r>
+        <w:t>Sí, como herramienta de apoyo para consultas técnicas puntuales, diagnóstico de errores, revisión de fragmentos de código, CSS y revisión de documentación. Cada cambio incorporado se comprobó y las decisiones técnicas, la interpretación de resultados y la responsabilidad final son del autor. La IA no se cita como fuente académica: la parte teórica se contrastó con las referencias originales.</w:t>
       </w:r>
     </w:p>
     <w:p>
@@ -10550,11 +10566,10 @@
       </w:pPr>
       <w:r>
         <w:t>2.</w:t>
-      </w:r>
-      <w:r>
         <w:tab/>
-        <w:t>Abre Detección y selecciona Combinado con 35 % heurística.</w:t>
-      </w:r>
+        <w:t>Abre Detección y selecciona Combinado con 45 % heurística.</w:t>
+      </w:r>
+      <w:r/>
     </w:p>
     <w:p>
       <w:pPr>
@@ -10837,7 +10852,7 @@
     </w:p>
     <w:p>
       <w:r>
-        <w:t>El fallback sintético permite ejecutar una demo limpia cuando faltan modelos; no se presenta como evaluación estadística. La evaluación independiente debe usar un CSV separado y una partición reproducible.</w:t>
+        <w:t>El fallback sintético permite ejecutar una demo limpia cuando faltan modelos; no se presenta como evaluación estadística. Las métricas finales proceden de holdouts y EML separados, y se acompañan de sus limitaciones de independencia y representatividad.</w:t>
       </w:r>
     </w:p>
     <w:p>

</xml_diff>